<commit_message>
Finalize audited thesis release
</commit_message>
<xml_diff>
--- a/thesis/CHPT1.docx
+++ b/thesis/CHPT1.docx
@@ -53,7 +53,7 @@
     </w:p>
     <w:p>
       <w:r>
-        <w:t>The central motivation of this thesis is therefore to connect recommendation and explanation through an inspectable artifact produced during ranking. The implemented system combines CLIP image and text representations with an expert-rule score. For every candidate, the rule component retains the five retrieved rules, their similarities, reliability weights, bonuses, and weighted contributions. After reranking, the selected recommendation and its exact symbolic trace are frozen. This trace is not a reconstruction created by the explanation model; it records evidence that numerically participated in the ranking decision.</w:t>
+        <w:t>The central motivation of this thesis is therefore to connect recommendation and explanation through an inspectable artifact produced during ranking. The implemented system combines CLIP image and text representations with a score derived from curated, source-grounded fashion rules. For every candidate, the rule component retains up to five eligible rules and their contributions. After reranking, the selected recommendation and its exact symbolic trace are frozen. This trace is not a reconstruction created by the explanation model; it records evidence that numerically participated in the ranking decision.</w:t>
       </w:r>
     </w:p>
     <w:p>
@@ -63,7 +63,7 @@
     </w:p>
     <w:p>
       <w:r>
-        <w:t>The study remains deliberately bounded. Images participate in representation and ranking, but they are not captioned and do not become textual explanation evidence. The task is sampled, same-category, controlled-pool ranking over held-out Polyvore outfits rather than personalised, full-catalogue serving. The symbolic trace explains the expert-rule component of a hybrid reranker, not every internal computation performed by CLIP. Explanation outcomes are measured through a frozen automated pipeline in which Qwen 3.5 9B extracts atomic claims and Phi-4 14B verifies them against the supplied sources. This role separation strengthens auditability, but the results remain operational system evaluation rather than human-validated ground truth.</w:t>
+        <w:t>The study remains deliberately bounded. Images participate in representation and ranking, but they are not captioned and do not become textual explanation evidence. The task is sampled, same-category, controlled-pool ranking over held-out Polyvore outfits rather than personalised, full-catalogue serving. The symbolic trace explains the fashion-rule component of a hybrid reranker, not every internal computation performed by CLIP. Explanation outcomes are measured through a frozen automated pipeline in which Qwen 3.5 9B extracts atomic claims and Phi-4 14B verifies them against the supplied sources. This role separation strengthens auditability, but the results remain operational system evaluation rather than human-validated ground truth.</w:t>
       </w:r>
     </w:p>
     <w:p>
@@ -96,7 +96,7 @@
     </w:p>
     <w:p>
       <w:r>
-        <w:t>This thesis addresses these problems through an evidence-aware hybrid architecture and a paired explanation experiment. Expert rules contribute numerically to reranking and are stored as exact trace B. Recommendation effectiveness is evaluated separately from evidence participation. For the same locked recommendation, trace-visible and trace-hidden explanations are compared using reranking-trace claim support, full-knowledge-base claim support, Unsupported Item-Fact Rate (UIFR), citation entailment, and trace-supported claims per 100 words. These measures preserve the distinction between a sentence that is stylistically plausible and a claim that is grounded in an auditable source.</w:t>
+        <w:t>This thesis addresses these problems through an evidence-aware hybrid architecture and a paired explanation experiment. Curated fashion rules contribute numerically to reranking and are stored as exact trace B. Recommendation effectiveness is evaluated separately from evidence participation. For the same locked recommendation, trace-visible and trace-hidden explanations are compared using reranking-trace claim support, full-knowledge-base claim support, Unsupported Item-Fact Rate (UIFR), citation entailment, and trace-supported claims per 100 words. These measures preserve the distinction between a sentence that is stylistically plausible and a claim that is grounded in an auditable source.</w:t>
       </w:r>
     </w:p>
     <w:p>
@@ -114,7 +114,7 @@
     </w:p>
     <w:p>
       <w:r>
-        <w:t>The aim of this thesis is to develop and evaluate an evidence-constrained multimodal fashion recommendation framework in which generated explanations can be assessed against the exact expert-rule trace used during recommendation.</w:t>
+        <w:t>The aim of this thesis is to develop and evaluate an evidence-constrained multimodal fashion recommendation framework in which generated explanations can be assessed against the exact fashion-rule trace used during recommendation.</w:t>
       </w:r>
     </w:p>
     <w:p>
@@ -124,12 +124,12 @@
     </w:p>
     <w:p>
       <w:r>
-        <w:t>The second objective is to make expert evidence participate directly in ranking. A curated rule base is retrieved and scored for each query-candidate pair, the top five contributions form an evidence score, and a frozen mixture of multimodal compatibility and evidence scores reranks the pool. The complete contributing trace is stored before explanation generation.</w:t>
+        <w:t>The second objective is to make source-grounded fashion evidence participate directly in ranking. A curated rule base is filtered and scored for each query-candidate pair, up to five eligible contributions form an evidence score, and a frozen mixture of multimodal compatibility and evidence scores reranks the pool. The complete contributing trace is stored before explanation generation.</w:t>
       </w:r>
     </w:p>
     <w:p>
       <w:r>
-        <w:t>The third objective is to compare post-hoc and trace-visible natural-language explanations under a paired design. Both conditions explain the same locked recommendation, use the same generator, decoding settings, and at-most-75-word instruction, and differ in access to exact trace B and the associated evidence/citation instructions.</w:t>
+        <w:t>The third objective is to compare post-hoc and trace-visible natural-language explanations under a paired design. Both conditions explain the same locked recommendation, use the same generator, decoding settings, and 45--75-word instruction, and differ in access to exact trace B and the associated evidence/citation instructions.</w:t>
       </w:r>
     </w:p>
     <w:p>
@@ -153,7 +153,7 @@
         <w:t>RQ1:</w:t>
       </w:r>
       <w:r>
-        <w:t xml:space="preserve"> To what extent does providing the exact five-rule reranking trace during generation improve claim support from that trace and from the final knowledge base, relative to a paired No-RAG baseline?</w:t>
+        <w:t xml:space="preserve"> To what extent does providing the exact retained reranking trace during generation improve claim support from that trace and from the final knowledge base, relative to a paired No-RAG baseline?</w:t>
       </w:r>
     </w:p>
     <w:p>
@@ -200,7 +200,7 @@
     </w:p>
     <w:p>
       <w:r>
-        <w:t>Recommendation effectiveness and evidence participation are supporting questions needed to interpret these RQs. The thesis tests whether multimodal fusion improves ranking relative to text pathways, whether expert evidence materially changes selection, and whether any change in conventional accuracy is statistically supported. These tests establish what kind of decision the explanations are describing; they are not used to redefine explanation faithfulness as recommendation accuracy.</w:t>
+        <w:t>Recommendation effectiveness and evidence participation are supporting questions needed to interpret these RQs. The thesis tests whether multimodal fusion improves ranking relative to the corresponding single-modality CLIP pathways and whether curated fashion evidence materially changes selection. These tests establish what kind of decision the explanations are describing; they are not used to redefine explanation faithfulness as recommendation accuracy.</w:t>
       </w:r>
     </w:p>
     <w:p>
@@ -232,7 +232,7 @@
     </w:p>
     <w:p>
       <w:r>
-        <w:t>The final expert knowledge base contains 200 curated styling rules, exactly 40 for each target category: bags, bottoms, outerwear, shoes, and tops. These rules provide an inspectable vocabulary for complementarity, formality, season, colour, and related styling considerations. They are not complete fashion knowledge, verified product metadata, or universal prescriptions. Support from a retrieved rule does not establish that the rule is universally correct for every person or context.</w:t>
+        <w:t>The final fashion knowledge base contains 200 manually curated, source-grounded styling rules, exactly 40 for each target category: bags, bottoms, outerwear, shoes, and tops. These rules provide an inspectable experimental vocabulary for complementarity, formality, season, colour, and related styling considerations. They are not complete fashion knowledge, independently certified professional advice, verified product metadata, or universal prescriptions. Support from a retrieved rule does not establish that the rule is universally correct for every person or context.</w:t>
       </w:r>
     </w:p>
     <w:p>
@@ -250,12 +250,12 @@
     </w:p>
     <w:p>
       <w:r>
-        <w:t>This thesis makes four principal contributions. First, it implements an end-to-end architecture in which an expert-rule trace is produced during multimodal reranking and retained for later explanation. Second, it introduces a paired evaluation design that locks recommendation identity, preventing recommendation differences from contaminating the explanation contrast. Third, it operationalises complementary claim-level measures of trace support, full-KB support, item-fact support, and citation entailment. Fourth, it provides a reproducible five-stage workflow with leakage control, validation-only tuning, frozen settings, canonical outputs, configuration hashes, and case-clustered statistical analysis.</w:t>
+        <w:t>This thesis makes four principal contributions. First, it implements an end-to-end architecture in which a source-grounded fashion-rule trace is produced during multimodal reranking and retained for later explanation. Second, it introduces a paired evaluation design that locks recommendation identity, preventing recommendation differences from contaminating the explanation contrast. Third, it operationalises complementary claim-level measures of trace support, full-KB support, item-fact support, and citation entailment. Fourth, it provides a reproducible five-stage workflow with leakage control, validation-only tuning, frozen settings, canonical outputs, configuration hashes, and case-clustered statistical analysis.</w:t>
       </w:r>
     </w:p>
     <w:p>
       <w:r>
-        <w:t>The contribution is intentionally not framed as a new state-of-the-art fashion ranker or proof that expert evidence increases relevance. In the final run, fused CLIP achieved the strongest conventional ranking effectiveness, while evidence reranking changed the top-ranked item in 26.5% of cases and slightly reduced aggregate ranking metrics. For explanations, trace access increased reranking-trace claim support by 21.02 percentage points and full-KB support by 21.40 points under complete-pair, case-clustered analysis; the UIFR comparison was inconclusive because only 53 pairs were eligible. Preserving this mixed result is part of the empirical contribution.</w:t>
+        <w:t>The contribution is intentionally not framed as a new state-of-the-art fashion ranker or proof that curated evidence increases relevance. In the final run, fused CLIP achieved the strongest conventional ranking effectiveness overall, while evidence reranking changed the top-ranked item in 26.5% of cases and reduced every reported aggregate ranking metric relative to fused CLIP. For explanations, trace access increased reranking-trace claim support by 21.02 percentage points and full-KB support by 21.40 points under complete-pair, case-clustered analysis; the UIFR comparison was inconclusive because only 53 pairs were eligible. Preserving this mixed result is part of the empirical contribution.</w:t>
       </w:r>
     </w:p>
     <w:p>
@@ -273,7 +273,7 @@
     </w:p>
     <w:p>
       <w:r>
-        <w:t>Chapter 3 specifies the staged methodology, data controls, multimodal representations, expert-rule retrieval, reranking, locked explanation intervention, operational metrics, and statistical procedures. Chapter 4 reports recommendation, explanation, heterogeneity, sensitivity, and qualitative results. Chapter 5 interprets those findings, separates accuracy from evidence alignment, states the limitations, and identifies controlled length, independent assessment, verified visual evidence, and user-centred evaluation as future work.</w:t>
+        <w:t>Chapter 3 specifies the staged methodology, data controls, multimodal representations, fashion-rule retrieval, reranking, locked explanation intervention, operational metrics, and statistical procedures. Chapter 4 reports recommendation and explanation results, subgroup stability, missingness, statistical checks, and the reproducibility record. Chapter 5 interprets those findings, separates accuracy from evidence alignment, states the limitations, and identifies independent assessment, verified visual evidence, user-centred evaluation, and a dataset-grounded compatibility knowledge graph as future work.</w:t>
       </w:r>
     </w:p>
     <w:p>

</xml_diff>